<commit_message>
Lab 5: producător-consumator cu pool de fire, varianta 4
ExecutorService cu pool fix de 5 fire și ArrayBlockingQueue ca depozit;
interfață grafică Swing și raport. Lab 4: celulele goale ale depozitului
nu mai dispar din fereastră.

Co-Authored-By: Claude Opus 5.5 <noreply@anthropic.com>
</commit_message>
<xml_diff>
--- a/Lab4/Raport_Lab4_PCD_Cornos_Spranceana.docx
+++ b/Lab4/Raport_Lab4_PCD_Cornos_Spranceana.docx
@@ -1344,7 +1344,7 @@
         <w:spacing w:after="160"/>
         <w:ind w:firstLine="567"/>
       </w:pPr>
-      <w:hyperlink w:history="1" r:id="rIdafm_lvkj7opouvycwvphf">
+      <w:hyperlink w:history="1" r:id="rIdbporyoxiztapjm_kixbbu">
         <w:r>
           <w:rPr>
             <w:rStyle w:val="Hyperlink"/>
@@ -4847,7 +4847,7 @@
           <w:sz w:val="17"/>
           <w:szCs w:val="17"/>
         </w:rPr>
-        <w:t xml:space="preserve">                celule[i].setText(ocupat ? String.valueOf(continut.charAt(i)) : "");</w:t>
+        <w:t xml:space="preserve">                celule[i].setText(ocupat ? String.valueOf(continut.charAt(i)) : " ");</w:t>
       </w:r>
     </w:p>
     <w:p>
@@ -5225,7 +5225,7 @@
           <w:sz w:val="17"/>
           <w:szCs w:val="17"/>
         </w:rPr>
-        <w:t xml:space="preserve">            celule[i] = new JLabel("", SwingConstants.CENTER);</w:t>
+        <w:t xml:space="preserve">            celule[i] = new JLabel(" ", SwingConstants.CENTER);</w:t>
       </w:r>
     </w:p>
     <w:p>

</xml_diff>